<commit_message>
Dokumentacja: poprawka spisu treści (numery stron nie zawijają się do nowej linii)
</commit_message>
<xml_diff>
--- a/Projekt zespołowy WR2.docx
+++ b/Projekt zespołowy WR2.docx
@@ -238,7 +238,7 @@
     <w:p>
       <w:pPr>
         <w:tabs>
-          <w:tab w:pos="9029" w:val="right" w:leader="dot"/>
+          <w:tab w:pos="8784" w:val="right" w:leader="dot"/>
         </w:tabs>
         <w:spacing w:after="60" w:line="276" w:lineRule="auto"/>
       </w:pPr>
@@ -261,7 +261,7 @@
     <w:p>
       <w:pPr>
         <w:tabs>
-          <w:tab w:pos="9029" w:val="right" w:leader="dot"/>
+          <w:tab w:pos="8784" w:val="right" w:leader="dot"/>
         </w:tabs>
         <w:spacing w:after="60" w:line="276" w:lineRule="auto"/>
         <w:ind w:left="432"/>
@@ -285,7 +285,7 @@
     <w:p>
       <w:pPr>
         <w:tabs>
-          <w:tab w:pos="9029" w:val="right" w:leader="dot"/>
+          <w:tab w:pos="8784" w:val="right" w:leader="dot"/>
         </w:tabs>
         <w:spacing w:after="60" w:line="276" w:lineRule="auto"/>
         <w:ind w:left="432"/>
@@ -309,7 +309,7 @@
     <w:p>
       <w:pPr>
         <w:tabs>
-          <w:tab w:pos="9029" w:val="right" w:leader="dot"/>
+          <w:tab w:pos="8784" w:val="right" w:leader="dot"/>
         </w:tabs>
         <w:spacing w:after="60" w:line="276" w:lineRule="auto"/>
         <w:ind w:left="432"/>
@@ -333,7 +333,7 @@
     <w:p>
       <w:pPr>
         <w:tabs>
-          <w:tab w:pos="9029" w:val="right" w:leader="dot"/>
+          <w:tab w:pos="8784" w:val="right" w:leader="dot"/>
         </w:tabs>
         <w:spacing w:after="60" w:line="276" w:lineRule="auto"/>
         <w:ind w:left="432"/>
@@ -357,7 +357,7 @@
     <w:p>
       <w:pPr>
         <w:tabs>
-          <w:tab w:pos="9029" w:val="right" w:leader="dot"/>
+          <w:tab w:pos="8784" w:val="right" w:leader="dot"/>
         </w:tabs>
         <w:spacing w:after="60" w:line="276" w:lineRule="auto"/>
       </w:pPr>
@@ -380,7 +380,7 @@
     <w:p>
       <w:pPr>
         <w:tabs>
-          <w:tab w:pos="9029" w:val="right" w:leader="dot"/>
+          <w:tab w:pos="8784" w:val="right" w:leader="dot"/>
         </w:tabs>
         <w:spacing w:after="60" w:line="276" w:lineRule="auto"/>
         <w:ind w:left="432"/>
@@ -404,7 +404,7 @@
     <w:p>
       <w:pPr>
         <w:tabs>
-          <w:tab w:pos="9029" w:val="right" w:leader="dot"/>
+          <w:tab w:pos="8784" w:val="right" w:leader="dot"/>
         </w:tabs>
         <w:spacing w:after="60" w:line="276" w:lineRule="auto"/>
         <w:ind w:left="432"/>
@@ -428,7 +428,7 @@
     <w:p>
       <w:pPr>
         <w:tabs>
-          <w:tab w:pos="9029" w:val="right" w:leader="dot"/>
+          <w:tab w:pos="8784" w:val="right" w:leader="dot"/>
         </w:tabs>
         <w:spacing w:after="60" w:line="276" w:lineRule="auto"/>
         <w:ind w:left="432"/>
@@ -452,7 +452,7 @@
     <w:p>
       <w:pPr>
         <w:tabs>
-          <w:tab w:pos="9029" w:val="right" w:leader="dot"/>
+          <w:tab w:pos="8784" w:val="right" w:leader="dot"/>
         </w:tabs>
         <w:spacing w:after="60" w:line="276" w:lineRule="auto"/>
         <w:ind w:left="432"/>
@@ -476,7 +476,7 @@
     <w:p>
       <w:pPr>
         <w:tabs>
-          <w:tab w:pos="9029" w:val="right" w:leader="dot"/>
+          <w:tab w:pos="8784" w:val="right" w:leader="dot"/>
         </w:tabs>
         <w:spacing w:after="60" w:line="276" w:lineRule="auto"/>
       </w:pPr>
@@ -499,7 +499,7 @@
     <w:p>
       <w:pPr>
         <w:tabs>
-          <w:tab w:pos="9029" w:val="right" w:leader="dot"/>
+          <w:tab w:pos="8784" w:val="right" w:leader="dot"/>
         </w:tabs>
         <w:spacing w:after="60" w:line="276" w:lineRule="auto"/>
         <w:ind w:left="432"/>
@@ -523,7 +523,7 @@
     <w:p>
       <w:pPr>
         <w:tabs>
-          <w:tab w:pos="9029" w:val="right" w:leader="dot"/>
+          <w:tab w:pos="8784" w:val="right" w:leader="dot"/>
         </w:tabs>
         <w:spacing w:after="60" w:line="276" w:lineRule="auto"/>
         <w:ind w:left="432"/>
@@ -547,7 +547,7 @@
     <w:p>
       <w:pPr>
         <w:tabs>
-          <w:tab w:pos="9029" w:val="right" w:leader="dot"/>
+          <w:tab w:pos="8784" w:val="right" w:leader="dot"/>
         </w:tabs>
         <w:spacing w:after="60" w:line="276" w:lineRule="auto"/>
         <w:ind w:left="432"/>
@@ -571,7 +571,7 @@
     <w:p>
       <w:pPr>
         <w:tabs>
-          <w:tab w:pos="9029" w:val="right" w:leader="dot"/>
+          <w:tab w:pos="8784" w:val="right" w:leader="dot"/>
         </w:tabs>
         <w:spacing w:after="60" w:line="276" w:lineRule="auto"/>
       </w:pPr>
@@ -594,7 +594,7 @@
     <w:p>
       <w:pPr>
         <w:tabs>
-          <w:tab w:pos="9029" w:val="right" w:leader="dot"/>
+          <w:tab w:pos="8784" w:val="right" w:leader="dot"/>
         </w:tabs>
         <w:spacing w:after="60" w:line="276" w:lineRule="auto"/>
       </w:pPr>
@@ -617,7 +617,7 @@
     <w:p>
       <w:pPr>
         <w:tabs>
-          <w:tab w:pos="9029" w:val="right" w:leader="dot"/>
+          <w:tab w:pos="8784" w:val="right" w:leader="dot"/>
         </w:tabs>
         <w:spacing w:after="60" w:line="276" w:lineRule="auto"/>
         <w:ind w:left="432"/>
@@ -641,7 +641,7 @@
     <w:p>
       <w:pPr>
         <w:tabs>
-          <w:tab w:pos="9029" w:val="right" w:leader="dot"/>
+          <w:tab w:pos="8784" w:val="right" w:leader="dot"/>
         </w:tabs>
         <w:spacing w:after="60" w:line="276" w:lineRule="auto"/>
         <w:ind w:left="432"/>
@@ -665,7 +665,7 @@
     <w:p>
       <w:pPr>
         <w:tabs>
-          <w:tab w:pos="9029" w:val="right" w:leader="dot"/>
+          <w:tab w:pos="8784" w:val="right" w:leader="dot"/>
         </w:tabs>
         <w:spacing w:after="60" w:line="276" w:lineRule="auto"/>
         <w:ind w:left="432"/>
@@ -689,7 +689,7 @@
     <w:p>
       <w:pPr>
         <w:tabs>
-          <w:tab w:pos="9029" w:val="right" w:leader="dot"/>
+          <w:tab w:pos="8784" w:val="right" w:leader="dot"/>
         </w:tabs>
         <w:spacing w:after="60" w:line="276" w:lineRule="auto"/>
       </w:pPr>
@@ -712,7 +712,7 @@
     <w:p>
       <w:pPr>
         <w:tabs>
-          <w:tab w:pos="9029" w:val="right" w:leader="dot"/>
+          <w:tab w:pos="8784" w:val="right" w:leader="dot"/>
         </w:tabs>
         <w:spacing w:after="60" w:line="276" w:lineRule="auto"/>
       </w:pPr>
@@ -735,7 +735,7 @@
     <w:p>
       <w:pPr>
         <w:tabs>
-          <w:tab w:pos="9029" w:val="right" w:leader="dot"/>
+          <w:tab w:pos="8784" w:val="right" w:leader="dot"/>
         </w:tabs>
         <w:spacing w:after="60" w:line="276" w:lineRule="auto"/>
       </w:pPr>

</xml_diff>